<commit_message>
Manuscript revision 8 in the Computers & Security article structure and layout
Sections follow the journal's published articles: introduction with
contributions and outline, related work, baseline and threat model,
design (with the leakage estimates), methodology, results, discussion,
limitations, conclusions and future work, then the declarations,
CRediT statement and data availability before the references. Run-in
paragraph headings become numbered subsections. Author-year citations
and reference list (elsarticle-harv), two-column 5p layout in Times,
Elsevier caption format, wide tables and figures across both columns,
DOIs as links. Captions keep the author's titles. Word version and the
round-8 letter follow (section numbers, pages, word count).

Co-Authored-By: Claude Fable 5.1 <noreply@anthropic.com>
Claude-Session: https://claude.ai/code/session_01RjWdFzUgYk6Hwie2YbnvyG
</commit_message>
<xml_diff>
--- a/paper/rebuttal_round8.docx
+++ b/paper/rebuttal_round8.docx
@@ -94,7 +94,7 @@
         <w:t xml:space="preserve">Manuscript.</w:t>
       </w:r>
       <w:r>
-        <w:t xml:space="preserve"> Revision 8 has 7,985 words from the title to the references inclusive (7,935 by a whitespace count) and 25 pages in the review format. Its scope, studies and claims are those of revision 7, and it has no highlights page.</w:t>
+        <w:t xml:space="preserve"> Revision 8 has 7,998 words from the title to the references inclusive (7,952 by a whitespace count) and 12 pages in the journal's two-column layout. Its scope, studies and claims are those of revision 7, and it has no highlights page.</w:t>
       </w:r>
     </w:p>
     <w:tbl>
@@ -662,7 +662,7 @@
         <w:t xml:space="preserve">Cold and warm bounds.</w:t>
       </w:r>
       <w:r>
-        <w:t xml:space="preserve"> Once the 7 exempt sends are set aside, the cold-start bound, Equation 3, holds on every run that starts cold (44 of 100), and the warm-start bound, Equation 4, holds on every run. The estimates order mean leakage in 18 of 18 decisive cells with the cold-start term and 17 of 18 with the warm-start term. The abstract, Section 7.6 and the conclusion now tell this qualified story, and the paper presents the twelve-step architecture as context for the destination comparison (Sections 7.1–7.4).</w:t>
+        <w:t xml:space="preserve"> Once the 7 exempt sends are set aside, the cold-start bound, Equation 3, holds on every run that starts cold (44 of 100), and the warm-start bound, Equation 4, holds on every run. The estimates order mean leakage in 18 of 18 decisive cells with the cold-start term and 17 of 18 with the warm-start term. The abstract, Section 6.6 and the conclusion now tell this qualified story, and the paper presents the twelve-step architecture as context for the destination comparison (Sections 6.1–6.4).</w:t>
       </w:r>
     </w:p>
     <w:p>
@@ -728,7 +728,7 @@
         <w:spacing w:after="120"/>
       </w:pPr>
       <w:r>
-        <w:t xml:space="preserve">Section 7.6 still reports the 30-block, 20-minute cell where the warm estimates differ by 0.8 messages and the measured difference is 6.6 [−27.2, 42.4]. It now places the exemption qualifier on both bounds, as the check computes them: 'Once 7 messages sent, exempt, to real users' trusted numbers are set aside, no counter run that started cold (44 of 100) exceeded Equation 3; three warm ones did, by 5 or 6 messages, and none exceeded Equation 4.' Two of those exempt sends are the seed-303 one-message excesses the reviewer identified (3 blocks, 25 against 24 and 73 against 72, one exempt send each; results/condition_check.md). We do not treat the missed cell as evidence against the estimates, and the paper does not call it one.</w:t>
+        <w:t xml:space="preserve">Section 6.6 still reports the 30-block, 20-minute cell where the warm estimates differ by 0.8 messages and the measured difference is 6.6 [−27.2, 42.4]. It now places the exemption qualifier on both bounds, as the check computes them: 'Once 7 messages sent, exempt, to real users' trusted numbers are set aside, no counter run that started cold (44 of 100) exceeded Equation 3; three warm ones did, by 5 or 6 messages, and none exceeded Equation 4.' Two of those exempt sends are the seed-303 one-message excesses the reviewer identified (3 blocks, 25 against 24 and 73 against 72, one exempt send each; results/condition_check.md). We do not treat the missed cell as evidence against the estimates, and the paper does not call it one.</w:t>
       </w:r>
     </w:p>
     <w:p>
@@ -743,7 +743,7 @@
         <w:t xml:space="preserve">Where:</w:t>
       </w:r>
       <w:r>
-        <w:t xml:space="preserve"> Manuscript abstract, Sections 7.6 and 9.</w:t>
+        <w:t xml:space="preserve"> Manuscript abstract, Sections 6.6 and 9.</w:t>
       </w:r>
     </w:p>
     <w:p>
@@ -793,7 +793,7 @@
         <w:spacing w:after="120"/>
       </w:pPr>
       <w:r>
-        <w:t xml:space="preserve">Agreed, and nothing in revision 8 widens the claims. Every cost claim is stated for simulated users (abstract: 'at a low cost to simulated users'; Section 6: results for returning users 'describe trusted identities only'). Section 7.1 gives the model rule behind each contained attack (the datacenter attacker 'scores in the challenge tier and declines challenges'; 'Step 5 refuses the premium range'). The limitations list the generator's favourable assumptions, and Section 8 calls the combined policy 'a hypothesis for real traffic, not a recommendation'. The limitations still end with 'Replaying real traffic is the experiment this paper most needs.'</w:t>
+        <w:t xml:space="preserve">Agreed, and nothing in revision 8 widens the claims. Every cost claim is stated for simulated users (abstract: 'at a low cost to simulated users'; Section 5.2: results for returning users 'describe trusted identities only'). Section 6.1 gives the model rule behind each contained attack (the datacenter attacker 'scores in the challenge tier and declines challenges'; 'Step 5 refuses the premium range'). The limitations list the generator's favourable assumptions, and Section 7 calls the combined policy 'a hypothesis for real traffic, not a recommendation'. The conclusion still names replaying real traffic as 'the experiment this paper most needs'.</w:t>
       </w:r>
     </w:p>
     <w:p>
@@ -808,7 +808,7 @@
         <w:t xml:space="preserve">Where:</w:t>
       </w:r>
       <w:r>
-        <w:t xml:space="preserve"> Manuscript abstract, Sections 6, 7.1 and 8.</w:t>
+        <w:t xml:space="preserve"> Manuscript abstract, Sections 5.2, 6.1, 7 and 8.</w:t>
       </w:r>
     </w:p>
     <w:p>
@@ -858,7 +858,7 @@
         <w:spacing w:after="120"/>
       </w:pPr>
       <w:r>
-        <w:t xml:space="preserve">The abstract now reads 'Under a second predeclared protocol on seeds and workloads held out from selection, …' (Q3). Section 6 keeps the chronology: the second protocol 'was written after the matched comparison had selected three counters and committed before its runs; six of its seed values had served other robustness points, never selection', and the rerun with 2.9.0 is reported there with its accounting.</w:t>
+        <w:t xml:space="preserve">The abstract now reads 'Under a second predeclared protocol on seeds and workloads held out from selection, …' (Q3). Section 5.3 keeps the chronology: the second protocol 'was written after the matched comparison had selected three counters and committed before its runs; six of its seed values had served other robustness points, never selection', and the rerun with 2.9.0 is reported there with its accounting.</w:t>
       </w:r>
     </w:p>
     <w:p>
@@ -873,7 +873,7 @@
         <w:t xml:space="preserve">Where:</w:t>
       </w:r>
       <w:r>
-        <w:t xml:space="preserve"> Manuscript abstract, Section 6.</w:t>
+        <w:t xml:space="preserve"> Manuscript abstract, Section 5.3.</w:t>
       </w:r>
     </w:p>
     <w:p>
@@ -923,7 +923,7 @@
         <w:spacing w:after="120"/>
       </w:pPr>
       <w:r>
-        <w:t xml:space="preserve">The limitations now say that selection used 'an unweighted sum of four scripted pumpers' leakage and a mean service target met on tuning seeds, which guarantees no service level elsewhere'. Both misses stay in Section 7.6: the selected sequential setting misses the first protocol's target by 0.18 points on seeds 0–9, and the 1,000-block counter falls 0.12 points below its target while passing the paired check. The instant-verifier exception is kept in the abstract ('all but 13 of 144 cells, all against an instantly verifying carrier') and in Section 7.6 ('against every attacker but the instant verifier (25, against 15 and 16)').</w:t>
+        <w:t xml:space="preserve">The limitations now say that selection used 'an unweighted sum of four scripted pumpers' leakage and a mean service target met on tuning seeds, which guarantees no service level elsewhere'. Both misses stay in Section 6.6: the selected sequential setting misses the first protocol's target by 0.18 points on seeds 0–9, and the 1,000-block counter falls 0.12 points below its target while passing the paired check. The instant-verifier exception is kept in the abstract ('all but 13 of 144 cells, all against an instantly verifying carrier') and in Section 6.6 ('against every attacker but the instant verifier (25, against 15 and 16)').</w:t>
       </w:r>
     </w:p>
     <w:p>
@@ -938,7 +938,7 @@
         <w:t xml:space="preserve">Where:</w:t>
       </w:r>
       <w:r>
-        <w:t xml:space="preserve"> Manuscript Sections 7.6 and 8.</w:t>
+        <w:t xml:space="preserve"> Manuscript Sections 6.6 and 8.</w:t>
       </w:r>
     </w:p>
     <w:p>
@@ -988,7 +988,7 @@
         <w:spacing w:after="120"/>
       </w:pPr>
       <w:r>
-        <w:t xml:space="preserve">We checked each statement that Section 7.6 draws from the four-carrier table against the per-carrier values (results/round5_analyses.md). Two needed qualifying. Counter and tests together leak least in the sum, but against the instant verifier the tuned sequential setting leaks less (22 against 28); Section 7.6 now reads 'Counter and tests together, explored outside the frozen claims, leaked least summed over the four carriers but not against the instant verifier (28; T300, c0: 22), …'. The degradation range '5 to 9 points' was a carrier average; it now reads 'every evaluated policy left those users 5 to 9 points worse off on average (2 to 12 per carrier; 8 with none)', and the conclusion that 'none shields a block an attacker shares' holds for every carrier. The human-like carrier's exception to the counter's gain was already stated ('with the human-like carrier alone, it cost them 1.9'). The paragraph that introduces the attacked-service table (now Table 8) adds that the sum 'can hide a carrier on which a policy loses (per carrier: artifact)'. The limitations keep 'Close rankings rest on ten or fewer seeds, and costs that round to zero are not shown equivalent.'</w:t>
+        <w:t xml:space="preserve">We checked each statement that Section 6.6 draws from the four-carrier table against the per-carrier values (results/round5_analyses.md). Two needed qualifying. Counter and tests together leak least in the sum, but against the instant verifier the tuned sequential setting leaks less (22 against 28); Section 6.6 now reads 'Counter and tests together, explored outside the frozen claims, leaked least summed over the four carriers but not against the instant verifier (28; T300, c0: 22), …'. The degradation range '5 to 9 points' was a carrier average; it now reads 'every evaluated policy left those users 5 to 9 points worse off on average (2 to 12 per carrier; 8 with none)', and the conclusion that 'none shields a block an attacker shares' holds for every carrier. The human-like carrier's exception to the counter's gain was already stated ('with the human-like carrier alone, it cost them 1.9'). The paragraph that introduces the attacked-service table (now Table 8) adds that the sum 'can hide a carrier on which a policy loses (per carrier: artifact)'. The limitations keep 'Close rankings rest on ten or fewer seeds, and costs that round to zero are not shown equivalent.'</w:t>
       </w:r>
     </w:p>
     <w:p>
@@ -1003,7 +1003,7 @@
         <w:t xml:space="preserve">Where:</w:t>
       </w:r>
       <w:r>
-        <w:t xml:space="preserve"> Manuscript Section 7.6 (the text introducing Table 8), Section 8; results/round5_analyses.md (per carrier).</w:t>
+        <w:t xml:space="preserve"> Manuscript Section 6.6 (the text introducing Table 8), Section 8; results/round5_analyses.md (per carrier).</w:t>
       </w:r>
     </w:p>
     <w:p>
@@ -1126,7 +1126,7 @@
         <w:spacing w:after="120"/>
       </w:pPr>
       <w:r>
-        <w:t xml:space="preserve">Agreed. Section 6 now says that release 2.9.0 'follows Redis in every rule compared, checked by differential tests', rather than that it keeps state as Redis does in general. It keeps 'The implementation was a research prototype', 'Step 11 was still not one transaction', and the scope of the real-Redis tests ('specific interleavings of two instances, not all'). We make no production-correctness claim.</w:t>
+        <w:t xml:space="preserve">Agreed. Section 5.1 now says that release 2.9.0 'follows Redis in every rule compared, checked by differential tests', rather than that it keeps state as Redis does in general. It keeps 'The implementation was a research prototype', 'Step 11 was still not one transaction', and the scope of the real-Redis tests ('specific interleavings of two instances, not all'). We make no production-correctness claim.</w:t>
       </w:r>
     </w:p>
     <w:p>
@@ -1141,7 +1141,7 @@
         <w:t xml:space="preserve">Where:</w:t>
       </w:r>
       <w:r>
-        <w:t xml:space="preserve"> Manuscript Section 6.</w:t>
+        <w:t xml:space="preserve"> Manuscript Section 5.1.</w:t>
       </w:r>
     </w:p>
     <w:p>
@@ -1191,7 +1191,7 @@
         <w:spacing w:after="120"/>
       </w:pPr>
       <w:r>
-        <w:t xml:space="preserve">We kept that wording: 'The leakages of these scripted adaptations are not bounds' (Section 7.8), 'break-even shares for scripted attackers under assumed prices, not bounds or criminal profit', and the heuristic limited to 'pumpers that solve no challenge and hold no exemption' (Section 8). No attack profile was added.</w:t>
+        <w:t xml:space="preserve">We kept that wording: 'The leakages of these scripted adaptations are not bounds' (Section 6.8), 'break-even shares for scripted attackers under assumed prices, not bounds or criminal profit', and the heuristic limited to 'pumpers that solve no challenge and hold no exemption' (Section 7). No attack profile was added.</w:t>
       </w:r>
     </w:p>
     <w:p>
@@ -1206,7 +1206,7 @@
         <w:t xml:space="preserve">Where:</w:t>
       </w:r>
       <w:r>
-        <w:t xml:space="preserve"> Manuscript Sections 7.8 and 8.</w:t>
+        <w:t xml:space="preserve"> Manuscript Sections 6.8 and 7.</w:t>
       </w:r>
     </w:p>
     <w:p>
@@ -1256,7 +1256,7 @@
         <w:spacing w:after="120"/>
       </w:pPr>
       <w:r>
-        <w:t xml:space="preserve">The restriction to the implemented policies stays in Section 7.6 ('we ranked only the implemented policies'), and Section 8 still lists tuned token buckets, other sequential statistics, per-client quotas within a block, carrier spend ceilings and bounded exemptions as outside the evaluation. The 2026 prefix/window paper is now positioned in Section 2 (Section 5 of this letter); no experiment was added.</w:t>
+        <w:t xml:space="preserve">The restriction to the implemented policies stays in Section 6.6 ('we ranked only the implemented policies'), and Section 8 still lists tuned token buckets, other sequential statistics, per-client quotas within a block, carrier spend ceilings and bounded exemptions as outside the evaluation. The 2026 prefix/window paper is now positioned in Section 2 (Section 5 of this letter); no experiment was added.</w:t>
       </w:r>
     </w:p>
     <w:p>
@@ -1271,7 +1271,7 @@
         <w:t xml:space="preserve">Where:</w:t>
       </w:r>
       <w:r>
-        <w:t xml:space="preserve"> Manuscript Sections 2, 7.6 and 8.</w:t>
+        <w:t xml:space="preserve"> Manuscript Sections 2, 6.6 and 8.</w:t>
       </w:r>
     </w:p>
     <w:p>
@@ -2203,7 +2203,7 @@
                 <w:sz w:val="18"/>
                 <w:szCs w:val="18"/>
               </w:rPr>
-              <w:t xml:space="preserve">Abstract and Section 9 vs Section 7.6</w:t>
+              <w:t xml:space="preserve">Abstract and Section 9 vs Section 6.6</w:t>
             </w:r>
           </w:p>
         </w:tc>
@@ -2295,7 +2295,7 @@
                 <w:sz w:val="18"/>
                 <w:szCs w:val="18"/>
               </w:rPr>
-              <w:t xml:space="preserve">Section 7.5 vs Table 6 (now Table 5)</w:t>
+              <w:t xml:space="preserve">Section 6.5 vs Table 6 (now Table 5)</w:t>
             </w:r>
           </w:p>
         </w:tc>
@@ -2458,7 +2458,7 @@
         <w:t xml:space="preserve">Numbering in revision 8.</w:t>
       </w:r>
       <w:r>
-        <w:t xml:space="preserve"> To make room for the related-work paragraph and the qualifications within the 8,000-word limit, revision 7's Table 3 (the study map) is now a supplementary map (results/study_map.md), cited in Section 6; supplementary Table S1 is unchanged. Revision 7's Tables 4 to 8 are therefore Tables 3 to 7, and revision 7's Table 9 is split into Tables 8 (pumper on shared blocks) and 9 (poisoner). Figure and equation numbers are unchanged.</w:t>
+        <w:t xml:space="preserve"> To make room for the related-work paragraph and the qualifications within the 8,000-word limit, revision 7's Table 3 (the study map) is now a supplementary map (results/study_map.md), cited in Section 5.3; supplementary Table S1 is unchanged. Revision 7's Tables 4 to 8 are therefore Tables 3 to 7, and revision 7's Table 9 is split into Tables 8 (pumper on shared blocks) and 9 (poisoner). Figure and equation numbers are unchanged. The sections now follow the journal's article structure: Introduction (1, with the contributions and an outline), Related work (2), Baseline and threat model (3), Design (4, which absorbs revision 7's Section 5, the leakage estimates, as Section 4.5), Methodology (5, revision 7's Section 6), Results (6, revision 7's Section 7), Discussion (7), Limitations (8) and Conclusions and future work (9); the run-in paragraph headings are numbered subsections, and the declarations, CRediT statement and data availability precede the references. Citations and the reference list use the journal's author-year style, and the manuscript is set in its two-column layout. This letter cites manuscript sections by the revision 8 numbering.</w:t>
       </w:r>
     </w:p>
     <w:p>
@@ -2478,7 +2478,7 @@
         <w:t xml:space="preserve">Table order.</w:t>
       </w:r>
       <w:r>
-        <w:t xml:space="preserve"> The attacker-profile table (now Table 3) was a fixed-position float; it is now a top float like its neighbours. In the compiled PDF, Tables 1 to 9 appear in order on pages 4, 5, 11, 11, 12, 13, 15, 16 and 16, and Figures 1 to 3 on pages 14, 15 and 19, which we checked page by page.</w:t>
+        <w:t xml:space="preserve"> The attacker-profile table (now Table 3) was a fixed-position float; it is now a top float like its neighbours. In the compiled PDF, Tables 1 to 9 appear in order on pages 2, 3, 5, 5, 6, 6, 7, 8 and 9, and Figures 1 to 3 on pages 7, 8 and 10, which we checked page by page.</w:t>
       </w:r>
     </w:p>
     <w:p>
@@ -2558,7 +2558,7 @@
         <w:t xml:space="preserve">The boundary narrative.</w:t>
       </w:r>
       <w:r>
-        <w:t xml:space="preserve"> Tables 8 and 9 are now set before the boundary discussion. The boundary paragraph, including the 18/18 and 17/18 results, the near-tie qualification and the algebraic-crossing statement, starts on page 17, after Tables 8 and 9 on page 16, and runs uninterrupted onto page 18, and Figure 3 follows on page 19. The adaptive-attacker results (E3), which followed in the same paragraph, are now a paragraph of their own after the figure.</w:t>
+        <w:t xml:space="preserve"> Tables 8 and 9 are now introduced and discussed before the boundary discussion, which has its own heading (Section 6.6.3). The boundary paragraph, including the 18/18 and 17/18 results, the near-tie qualification and the algebraic-crossing statement, starts on page 7 and runs onto page 8 with no float inside it; the two tables are set at the foot of page 8 and the head of page 9, and Figure 3 follows on page 10. The adaptive-attacker results (E3), which followed in the same paragraph, are now a paragraph of their own.</w:t>
       </w:r>
     </w:p>
     <w:p>

</xml_diff>